<commit_message>
Migrar documentacion a PHP 8.2 + Laravel 11 + MySQL 8
</commit_message>
<xml_diff>
--- a/_docs_/trim01/03_elicitacion_requisitos/Benchmarking_CONTROL_STORE_APA.docx
+++ b/_docs_/trim01/03_elicitacion_requisitos/Benchmarking_CONTROL_STORE_APA.docx
@@ -1161,7 +1161,7 @@
                 <w:sz w:val="20"/>
                 <w:szCs w:val="20"/>
               </w:rPr>
-              <w:t>Python/Django con PostgreSQL para alta concurrencia.</w:t>
+              <w:t>PHP/Laravel con MySQL 8 para alta concurrencia.</w:t>
             </w:r>
           </w:p>
         </w:tc>
@@ -1222,7 +1222,7 @@
         <w:jc w:val="both"/>
       </w:pPr>
       <w:r>
-        <w:t>A diferencia de las limitaciones encontradas en el software básico, CONTROL STORE garantizará la escalabilidad mediante el uso de PostgreSQL, permitiendo un registro ilimitado de productos y un control estricto sobre las fechas de caducidad.</w:t>
+        <w:t>A diferencia de las limitaciones encontradas en el software básico, CONTROL STORE garantizará la escalabilidad mediante el uso de MySQL 8, permitiendo un registro ilimitado de productos y un control estricto sobre las fechas de caducidad.</w:t>
       </w:r>
     </w:p>
     <w:p/>

</xml_diff>